<commit_message>
docs(rulebook): v1.9 - add Rule 0.2 (working folder restriction), Rule 2.11 and Check 5.21 (List Number numbering restart)
</commit_message>
<xml_diff>
--- a/policies/build/HCO_v2_Master_Rulebook_and_Verification_Checklist.docx
+++ b/policies/build/HCO_v2_Master_Rulebook_and_Verification_Checklist.docx
@@ -8,7 +8,7 @@
         <w:rPr>
           <w:i/>
         </w:rPr>
-        <w:t>Version 1.8 – September 2026. Adds explicit mandatory pattern check to Check 5.8 (References / Rule 2.8 audit): Check 5.8 must now specifically search every References section for the ‘Guidebook interpretation supplied for…’ artefact string, confirmed as a recurring generator artefact found across all 20 COP documents and previously in AAC.9-13. All prior content preserved unchanged.</w:t>
+        <w:t>Version 1.9 – September 2026. Adds Rule 0.2 (Working folder restriction — chapter audit session scope) and Rule 2.11 (List Number style numbering restart — numId startOverride fix), with corresponding Check 5.21. All prior content preserved unchanged.</w:t>
       </w:r>
     </w:p>
     <w:p>
@@ -59,6 +59,14 @@
         <w:pStyle w:val="ListBullet"/>
       </w:pPr>
       <w:r>
+        <w:t>0.2 – Working folder restriction [NEW v1.9]</w:t>
+      </w:r>
+    </w:p>
+    <w:p>
+      <w:pPr>
+        <w:pStyle w:val="ListBullet"/>
+      </w:pPr>
+      <w:r>
         <w:t>Section 1 – The Core Principle</w:t>
       </w:r>
     </w:p>
@@ -179,6 +187,14 @@
         <w:pStyle w:val="ListBullet"/>
       </w:pPr>
       <w:r>
+        <w:t>2.11 – List Number style numbering restart [NEW v1.9]</w:t>
+      </w:r>
+    </w:p>
+    <w:p>
+      <w:pPr>
+        <w:pStyle w:val="ListBullet"/>
+      </w:pPr>
+      <w:r>
         <w:t>Section 3 – Structure and Formatting Rules</w:t>
       </w:r>
     </w:p>
@@ -483,6 +499,14 @@
         <w:pStyle w:val="ListBullet"/>
       </w:pPr>
       <w:r>
+        <w:t>5.21 – List Number restart audit [NEW v1.9]</w:t>
+      </w:r>
+    </w:p>
+    <w:p>
+      <w:pPr>
+        <w:pStyle w:val="ListBullet"/>
+      </w:pPr>
+      <w:r>
         <w:t>Section 6 – Git Discipline</w:t>
       </w:r>
     </w:p>
@@ -668,6 +692,20 @@
     </w:p>
     <w:p>
       <w:pPr>
+        <w:pStyle w:val="Heading2"/>
+      </w:pPr>
+      <w:r>
+        <w:t>0.2 – Working folder restriction [NEW v1.9]</w:t>
+      </w:r>
+    </w:p>
+    <w:p>
+      <w:pPr/>
+      <w:r>
+        <w:t>When auditing or fixing a chapter’s REWRITE_DRAFT files, work exclusively inside that chapter’s folder: policies/build/chapters_v2/&lt;CHAPTER&gt;/. Do not open, reference, list, or modify anything in generate_hco_*.py, hco_*_methods.py, pre_v2_common.py, render_pre_v2.ts, masters_hco/, preview_hco/, drafts_hco/, or rewrite_reference/ under any circumstances during a chapter audit task, even if a file with a similar or matching name exists there. These are separate, older pipelines unrelated to the REWRITE_DRAFT audit work. Before making any edit in a chapter audit session, list the exact file paths inside chapters_v2/&lt;CHAPTER&gt;/ that will be touched and wait for explicit confirmation before proceeding. This restriction applies for the entire session, not just the first action — a session that starts correctly scoped must not drift into these folders later even when investigating a render pipeline, template source, or file-history question.</w:t>
+      </w:r>
+    </w:p>
+    <w:p>
+      <w:pPr>
         <w:pStyle w:val="Heading1"/>
       </w:pPr>
       <w:r>
@@ -1224,6 +1262,20 @@
     </w:p>
     <w:p>
       <w:pPr>
+        <w:pStyle w:val="Heading2"/>
+      </w:pPr>
+      <w:r>
+        <w:t>2.11 – List Number style numbering restart [NEW v1.9]</w:t>
+      </w:r>
+    </w:p>
+    <w:p>
+      <w:pPr/>
+      <w:r>
+        <w:t>The document’s ‘List Number’ paragraph style is defined with a single shared numId at the style level, meaning every section using this style (Non-Negotiable Rules, Required Records/Evidence Checklist, References, and any numbered sub-list inside ‘What We Do’) will share one continuous running count unless each section is given its own explicit numId with startOverride=1. Before finalizing any chapter, detect every group of consecutive List Number paragraphs in each document and confirm each group has its own independent numId that restarts at 1. A later section’s list continuing to count from an earlier section (e.g. References starting at 21 instead of 1) is a Rule 2.11 violation. Fix: assign each group its own numId with startOverride=1.</w:t>
+      </w:r>
+    </w:p>
+    <w:p>
+      <w:pPr>
         <w:pStyle w:val="Heading1"/>
       </w:pPr>
       <w:r>
@@ -2154,6 +2206,20 @@
       <w:pPr/>
       <w:r>
         <w:t>This check applies to every document regardless of chapter. Pointer phrases to search for include: “refer to the Glossary,” “see Appendix,” “refer to the policy on,” “as defined in the attached table,” “see the list below” (where no list follows), “see Section” (where the named section does not exist), and similar constructions.</w:t>
+      </w:r>
+    </w:p>
+    <w:p>
+      <w:pPr>
+        <w:pStyle w:val="Heading2"/>
+      </w:pPr>
+      <w:r>
+        <w:t>5.21 – List Number restart audit [NEW v1.9]</w:t>
+      </w:r>
+    </w:p>
+    <w:p>
+      <w:pPr/>
+      <w:r>
+        <w:t>For every document, list every group of consecutive List Number paragraphs and confirm no two groups share a numId.</w:t>
       </w:r>
     </w:p>
     <w:p>

</xml_diff>